<commit_message>
Software 1.º Esencial v2: maquetación de Planes de Clase y Plan Anual (auditoría ChatGPT v2, V2-01 y V2-02)
- Planes de Clase: de 60 a 38 páginas, cada plan en una hoja oficio (márgenes 1,27 cm, tablas al ancho útil, 9 pt); índice regenerado.
- Plan Anual: de 12 a 10 páginas, sin hoja de firma suelta.
- Muestra: termina en el Plan 1 en una hoja (13 páginas).
- Texto idéntico al de la v1; controles v2 94 OK, auditoría de contenido 117 OK.

Co-Authored-By: Claude Opus 5.5 <noreply@anthropic.com>
Claude-Session: https://claude.ai/code/session_01LqBrALZn8HbnzzUtvCFRMa
</commit_message>
<xml_diff>
--- a/software_1_esencial/salida/Gabinete_Informatica_Software_1er_Curso_PLAN_ANUAL_COMERCIAL_2026.docx
+++ b/software_1_esencial/salida/Gabinete_Informatica_Software_1er_Curso_PLAN_ANUAL_COMERCIAL_2026.docx
@@ -7,7 +7,7 @@
         <w:spacing w:before="0" w:after="0"/>
         <w:sectPr>
           <w:pgSz w:w="12240" w:h="18720"/>
-          <w:pgMar w:top="850" w:right="850" w:bottom="850" w:left="850" w:header="720" w:footer="720" w:gutter="0"/>
+          <w:pgMar w:top="720" w:right="720" w:bottom="720" w:left="720" w:header="340" w:footer="340" w:gutter="0"/>
           <w:cols w:space="720"/>
           <w:docGrid w:linePitch="360"/>
         </w:sectPr>
@@ -98,7 +98,7 @@
       <w:tblPr>
         <w:tblStyle w:val="TableGrid"/>
         <w:tblLook w:firstColumn="1" w:firstRow="1" w:lastColumn="0" w:lastRow="0" w:noHBand="0" w:noVBand="1" w:val="04A0"/>
-        <w:tblW w:w="15141" w:type="dxa"/>
+        <w:tblW w:w="17280" w:type="dxa"/>
         <w:tblLayout w:type="fixed"/>
         <w:tblBorders>
           <w:top w:val="single" w:sz="4" w:color="A5C8A7"/>
@@ -116,13 +116,13 @@
         </w:tblCellMar>
       </w:tblPr>
       <w:tblGrid>
-        <w:gridCol w:w="620"/>
-        <w:gridCol w:w="2300"/>
-        <w:gridCol w:w="3460"/>
-        <w:gridCol w:w="800"/>
-        <w:gridCol w:w="3400"/>
-        <w:gridCol w:w="2700"/>
-        <w:gridCol w:w="1861"/>
+        <w:gridCol w:w="708"/>
+        <w:gridCol w:w="2625"/>
+        <w:gridCol w:w="3949"/>
+        <w:gridCol w:w="913"/>
+        <w:gridCol w:w="3880"/>
+        <w:gridCol w:w="3081"/>
+        <w:gridCol w:w="2124"/>
       </w:tblGrid>
       <w:tr>
         <w:trPr>
@@ -130,7 +130,7 @@
         </w:trPr>
         <w:tc>
           <w:tcPr>
-            <w:tcW w:type="dxa" w:w="620"/>
+            <w:tcW w:type="dxa" w:w="708"/>
             <w:shd w:val="clear" w:color="auto" w:fill="1B5E20"/>
           </w:tcPr>
           <w:p>
@@ -150,7 +150,7 @@
         </w:tc>
         <w:tc>
           <w:tcPr>
-            <w:tcW w:type="dxa" w:w="2300"/>
+            <w:tcW w:type="dxa" w:w="2625"/>
             <w:shd w:val="clear" w:color="auto" w:fill="1B5E20"/>
           </w:tcPr>
           <w:p>
@@ -170,7 +170,7 @@
         </w:tc>
         <w:tc>
           <w:tcPr>
-            <w:tcW w:type="dxa" w:w="3460"/>
+            <w:tcW w:type="dxa" w:w="3949"/>
             <w:shd w:val="clear" w:color="auto" w:fill="1B5E20"/>
           </w:tcPr>
           <w:p>
@@ -190,7 +190,7 @@
         </w:tc>
         <w:tc>
           <w:tcPr>
-            <w:tcW w:type="dxa" w:w="800"/>
+            <w:tcW w:type="dxa" w:w="913"/>
             <w:shd w:val="clear" w:color="auto" w:fill="1B5E20"/>
           </w:tcPr>
           <w:p>
@@ -210,7 +210,7 @@
         </w:tc>
         <w:tc>
           <w:tcPr>
-            <w:tcW w:type="dxa" w:w="3400"/>
+            <w:tcW w:type="dxa" w:w="3880"/>
             <w:shd w:val="clear" w:color="auto" w:fill="1B5E20"/>
           </w:tcPr>
           <w:p>
@@ -230,7 +230,7 @@
         </w:tc>
         <w:tc>
           <w:tcPr>
-            <w:tcW w:type="dxa" w:w="2700"/>
+            <w:tcW w:type="dxa" w:w="3081"/>
             <w:shd w:val="clear" w:color="auto" w:fill="1B5E20"/>
           </w:tcPr>
           <w:p>
@@ -250,7 +250,7 @@
         </w:tc>
         <w:tc>
           <w:tcPr>
-            <w:tcW w:type="dxa" w:w="1861"/>
+            <w:tcW w:type="dxa" w:w="2124"/>
             <w:shd w:val="clear" w:color="auto" w:fill="1B5E20"/>
           </w:tcPr>
           <w:p>
@@ -275,7 +275,7 @@
         </w:trPr>
         <w:tc>
           <w:tcPr>
-            <w:tcW w:type="dxa" w:w="15141"/>
+            <w:tcW w:type="dxa" w:w="17280"/>
             <w:gridSpan w:val="7"/>
             <w:shd w:val="clear" w:color="auto" w:fill="2E7D32"/>
           </w:tcPr>
@@ -301,7 +301,7 @@
         </w:trPr>
         <w:tc>
           <w:tcPr>
-            <w:tcW w:type="dxa" w:w="15141"/>
+            <w:tcW w:type="dxa" w:w="17280"/>
             <w:gridSpan w:val="7"/>
             <w:shd w:val="clear" w:color="auto" w:fill="E8F5E9"/>
           </w:tcPr>
@@ -327,7 +327,7 @@
         </w:trPr>
         <w:tc>
           <w:tcPr>
-            <w:tcW w:type="dxa" w:w="620"/>
+            <w:tcW w:type="dxa" w:w="708"/>
           </w:tcPr>
           <w:p>
             <w:pPr>
@@ -346,7 +346,7 @@
         </w:tc>
         <w:tc>
           <w:tcPr>
-            <w:tcW w:type="dxa" w:w="2300"/>
+            <w:tcW w:type="dxa" w:w="2625"/>
           </w:tcPr>
           <w:p>
             <w:pPr>
@@ -389,7 +389,7 @@
         </w:tc>
         <w:tc>
           <w:tcPr>
-            <w:tcW w:type="dxa" w:w="3460"/>
+            <w:tcW w:type="dxa" w:w="3949"/>
           </w:tcPr>
           <w:p>
             <w:pPr>
@@ -410,7 +410,7 @@
         </w:tc>
         <w:tc>
           <w:tcPr>
-            <w:tcW w:type="dxa" w:w="800"/>
+            <w:tcW w:type="dxa" w:w="913"/>
           </w:tcPr>
           <w:p>
             <w:pPr>
@@ -427,7 +427,7 @@
         </w:tc>
         <w:tc>
           <w:tcPr>
-            <w:tcW w:type="dxa" w:w="3400"/>
+            <w:tcW w:type="dxa" w:w="3880"/>
           </w:tcPr>
           <w:p>
             <w:pPr>
@@ -444,7 +444,7 @@
         </w:tc>
         <w:tc>
           <w:tcPr>
-            <w:tcW w:type="dxa" w:w="2700"/>
+            <w:tcW w:type="dxa" w:w="3081"/>
           </w:tcPr>
           <w:p>
             <w:pPr>
@@ -461,7 +461,7 @@
         </w:tc>
         <w:tc>
           <w:tcPr>
-            <w:tcW w:type="dxa" w:w="1861"/>
+            <w:tcW w:type="dxa" w:w="2124"/>
           </w:tcPr>
           <w:p>
             <w:pPr>
@@ -483,7 +483,7 @@
         </w:trPr>
         <w:tc>
           <w:tcPr>
-            <w:tcW w:type="dxa" w:w="620"/>
+            <w:tcW w:type="dxa" w:w="708"/>
           </w:tcPr>
           <w:p>
             <w:pPr>
@@ -502,7 +502,7 @@
         </w:tc>
         <w:tc>
           <w:tcPr>
-            <w:tcW w:type="dxa" w:w="2300"/>
+            <w:tcW w:type="dxa" w:w="2625"/>
           </w:tcPr>
           <w:p>
             <w:pPr>
@@ -545,7 +545,7 @@
         </w:tc>
         <w:tc>
           <w:tcPr>
-            <w:tcW w:type="dxa" w:w="3460"/>
+            <w:tcW w:type="dxa" w:w="3949"/>
           </w:tcPr>
           <w:p>
             <w:pPr>
@@ -566,7 +566,7 @@
         </w:tc>
         <w:tc>
           <w:tcPr>
-            <w:tcW w:type="dxa" w:w="800"/>
+            <w:tcW w:type="dxa" w:w="913"/>
           </w:tcPr>
           <w:p>
             <w:pPr>
@@ -583,7 +583,7 @@
         </w:tc>
         <w:tc>
           <w:tcPr>
-            <w:tcW w:type="dxa" w:w="3400"/>
+            <w:tcW w:type="dxa" w:w="3880"/>
           </w:tcPr>
           <w:p>
             <w:pPr>
@@ -600,7 +600,7 @@
         </w:tc>
         <w:tc>
           <w:tcPr>
-            <w:tcW w:type="dxa" w:w="2700"/>
+            <w:tcW w:type="dxa" w:w="3081"/>
           </w:tcPr>
           <w:p>
             <w:pPr>
@@ -617,7 +617,7 @@
         </w:tc>
         <w:tc>
           <w:tcPr>
-            <w:tcW w:type="dxa" w:w="1861"/>
+            <w:tcW w:type="dxa" w:w="2124"/>
           </w:tcPr>
           <w:p>
             <w:pPr>
@@ -639,7 +639,7 @@
         </w:trPr>
         <w:tc>
           <w:tcPr>
-            <w:tcW w:type="dxa" w:w="620"/>
+            <w:tcW w:type="dxa" w:w="708"/>
           </w:tcPr>
           <w:p>
             <w:pPr>
@@ -658,7 +658,7 @@
         </w:tc>
         <w:tc>
           <w:tcPr>
-            <w:tcW w:type="dxa" w:w="2300"/>
+            <w:tcW w:type="dxa" w:w="2625"/>
           </w:tcPr>
           <w:p>
             <w:pPr>
@@ -701,7 +701,7 @@
         </w:tc>
         <w:tc>
           <w:tcPr>
-            <w:tcW w:type="dxa" w:w="3460"/>
+            <w:tcW w:type="dxa" w:w="3949"/>
           </w:tcPr>
           <w:p>
             <w:pPr>
@@ -720,7 +720,7 @@
         </w:tc>
         <w:tc>
           <w:tcPr>
-            <w:tcW w:type="dxa" w:w="800"/>
+            <w:tcW w:type="dxa" w:w="913"/>
           </w:tcPr>
           <w:p>
             <w:pPr>
@@ -737,7 +737,7 @@
         </w:tc>
         <w:tc>
           <w:tcPr>
-            <w:tcW w:type="dxa" w:w="3400"/>
+            <w:tcW w:type="dxa" w:w="3880"/>
           </w:tcPr>
           <w:p>
             <w:pPr>
@@ -754,7 +754,7 @@
         </w:tc>
         <w:tc>
           <w:tcPr>
-            <w:tcW w:type="dxa" w:w="2700"/>
+            <w:tcW w:type="dxa" w:w="3081"/>
           </w:tcPr>
           <w:p>
             <w:pPr>
@@ -771,7 +771,7 @@
         </w:tc>
         <w:tc>
           <w:tcPr>
-            <w:tcW w:type="dxa" w:w="1861"/>
+            <w:tcW w:type="dxa" w:w="2124"/>
           </w:tcPr>
           <w:p>
             <w:pPr>
@@ -793,7 +793,7 @@
         </w:trPr>
         <w:tc>
           <w:tcPr>
-            <w:tcW w:type="dxa" w:w="620"/>
+            <w:tcW w:type="dxa" w:w="708"/>
           </w:tcPr>
           <w:p>
             <w:pPr>
@@ -812,7 +812,7 @@
         </w:tc>
         <w:tc>
           <w:tcPr>
-            <w:tcW w:type="dxa" w:w="2300"/>
+            <w:tcW w:type="dxa" w:w="2625"/>
           </w:tcPr>
           <w:p>
             <w:pPr>
@@ -855,7 +855,7 @@
         </w:tc>
         <w:tc>
           <w:tcPr>
-            <w:tcW w:type="dxa" w:w="3460"/>
+            <w:tcW w:type="dxa" w:w="3949"/>
           </w:tcPr>
           <w:p>
             <w:pPr>
@@ -876,7 +876,7 @@
         </w:tc>
         <w:tc>
           <w:tcPr>
-            <w:tcW w:type="dxa" w:w="800"/>
+            <w:tcW w:type="dxa" w:w="913"/>
           </w:tcPr>
           <w:p>
             <w:pPr>
@@ -893,7 +893,7 @@
         </w:tc>
         <w:tc>
           <w:tcPr>
-            <w:tcW w:type="dxa" w:w="3400"/>
+            <w:tcW w:type="dxa" w:w="3880"/>
           </w:tcPr>
           <w:p>
             <w:pPr>
@@ -910,7 +910,7 @@
         </w:tc>
         <w:tc>
           <w:tcPr>
-            <w:tcW w:type="dxa" w:w="2700"/>
+            <w:tcW w:type="dxa" w:w="3081"/>
           </w:tcPr>
           <w:p>
             <w:pPr>
@@ -927,7 +927,7 @@
         </w:tc>
         <w:tc>
           <w:tcPr>
-            <w:tcW w:type="dxa" w:w="1861"/>
+            <w:tcW w:type="dxa" w:w="2124"/>
           </w:tcPr>
           <w:p>
             <w:pPr>
@@ -949,7 +949,7 @@
         </w:trPr>
         <w:tc>
           <w:tcPr>
-            <w:tcW w:type="dxa" w:w="620"/>
+            <w:tcW w:type="dxa" w:w="708"/>
           </w:tcPr>
           <w:p>
             <w:pPr>
@@ -968,7 +968,7 @@
         </w:tc>
         <w:tc>
           <w:tcPr>
-            <w:tcW w:type="dxa" w:w="2300"/>
+            <w:tcW w:type="dxa" w:w="2625"/>
           </w:tcPr>
           <w:p>
             <w:pPr>
@@ -1011,7 +1011,7 @@
         </w:tc>
         <w:tc>
           <w:tcPr>
-            <w:tcW w:type="dxa" w:w="3460"/>
+            <w:tcW w:type="dxa" w:w="3949"/>
           </w:tcPr>
           <w:p>
             <w:pPr>
@@ -1032,7 +1032,7 @@
         </w:tc>
         <w:tc>
           <w:tcPr>
-            <w:tcW w:type="dxa" w:w="800"/>
+            <w:tcW w:type="dxa" w:w="913"/>
           </w:tcPr>
           <w:p>
             <w:pPr>
@@ -1049,7 +1049,7 @@
         </w:tc>
         <w:tc>
           <w:tcPr>
-            <w:tcW w:type="dxa" w:w="3400"/>
+            <w:tcW w:type="dxa" w:w="3880"/>
           </w:tcPr>
           <w:p>
             <w:pPr>
@@ -1066,7 +1066,7 @@
         </w:tc>
         <w:tc>
           <w:tcPr>
-            <w:tcW w:type="dxa" w:w="2700"/>
+            <w:tcW w:type="dxa" w:w="3081"/>
           </w:tcPr>
           <w:p>
             <w:pPr>
@@ -1083,7 +1083,7 @@
         </w:tc>
         <w:tc>
           <w:tcPr>
-            <w:tcW w:type="dxa" w:w="1861"/>
+            <w:tcW w:type="dxa" w:w="2124"/>
           </w:tcPr>
           <w:p>
             <w:pPr>
@@ -1105,7 +1105,7 @@
         </w:trPr>
         <w:tc>
           <w:tcPr>
-            <w:tcW w:type="dxa" w:w="620"/>
+            <w:tcW w:type="dxa" w:w="708"/>
           </w:tcPr>
           <w:p>
             <w:pPr>
@@ -1124,7 +1124,7 @@
         </w:tc>
         <w:tc>
           <w:tcPr>
-            <w:tcW w:type="dxa" w:w="2300"/>
+            <w:tcW w:type="dxa" w:w="2625"/>
           </w:tcPr>
           <w:p>
             <w:pPr>
@@ -1167,7 +1167,7 @@
         </w:tc>
         <w:tc>
           <w:tcPr>
-            <w:tcW w:type="dxa" w:w="3460"/>
+            <w:tcW w:type="dxa" w:w="3949"/>
           </w:tcPr>
           <w:p>
             <w:pPr>
@@ -1186,7 +1186,7 @@
         </w:tc>
         <w:tc>
           <w:tcPr>
-            <w:tcW w:type="dxa" w:w="800"/>
+            <w:tcW w:type="dxa" w:w="913"/>
           </w:tcPr>
           <w:p>
             <w:pPr>
@@ -1203,7 +1203,7 @@
         </w:tc>
         <w:tc>
           <w:tcPr>
-            <w:tcW w:type="dxa" w:w="3400"/>
+            <w:tcW w:type="dxa" w:w="3880"/>
           </w:tcPr>
           <w:p>
             <w:pPr>
@@ -1220,7 +1220,7 @@
         </w:tc>
         <w:tc>
           <w:tcPr>
-            <w:tcW w:type="dxa" w:w="2700"/>
+            <w:tcW w:type="dxa" w:w="3081"/>
           </w:tcPr>
           <w:p>
             <w:pPr>
@@ -1237,7 +1237,7 @@
         </w:tc>
         <w:tc>
           <w:tcPr>
-            <w:tcW w:type="dxa" w:w="1861"/>
+            <w:tcW w:type="dxa" w:w="2124"/>
           </w:tcPr>
           <w:p>
             <w:pPr>
@@ -1259,7 +1259,7 @@
         </w:trPr>
         <w:tc>
           <w:tcPr>
-            <w:tcW w:type="dxa" w:w="620"/>
+            <w:tcW w:type="dxa" w:w="708"/>
           </w:tcPr>
           <w:p>
             <w:pPr>
@@ -1278,7 +1278,7 @@
         </w:tc>
         <w:tc>
           <w:tcPr>
-            <w:tcW w:type="dxa" w:w="2300"/>
+            <w:tcW w:type="dxa" w:w="2625"/>
           </w:tcPr>
           <w:p>
             <w:pPr>
@@ -1321,7 +1321,7 @@
         </w:tc>
         <w:tc>
           <w:tcPr>
-            <w:tcW w:type="dxa" w:w="3460"/>
+            <w:tcW w:type="dxa" w:w="3949"/>
           </w:tcPr>
           <w:p>
             <w:pPr>
@@ -1342,7 +1342,7 @@
         </w:tc>
         <w:tc>
           <w:tcPr>
-            <w:tcW w:type="dxa" w:w="800"/>
+            <w:tcW w:type="dxa" w:w="913"/>
           </w:tcPr>
           <w:p>
             <w:pPr>
@@ -1359,7 +1359,7 @@
         </w:tc>
         <w:tc>
           <w:tcPr>
-            <w:tcW w:type="dxa" w:w="3400"/>
+            <w:tcW w:type="dxa" w:w="3880"/>
           </w:tcPr>
           <w:p>
             <w:pPr>
@@ -1376,7 +1376,7 @@
         </w:tc>
         <w:tc>
           <w:tcPr>
-            <w:tcW w:type="dxa" w:w="2700"/>
+            <w:tcW w:type="dxa" w:w="3081"/>
           </w:tcPr>
           <w:p>
             <w:pPr>
@@ -1393,7 +1393,7 @@
         </w:tc>
         <w:tc>
           <w:tcPr>
-            <w:tcW w:type="dxa" w:w="1861"/>
+            <w:tcW w:type="dxa" w:w="2124"/>
           </w:tcPr>
           <w:p>
             <w:pPr>
@@ -1415,7 +1415,7 @@
         </w:trPr>
         <w:tc>
           <w:tcPr>
-            <w:tcW w:type="dxa" w:w="620"/>
+            <w:tcW w:type="dxa" w:w="708"/>
           </w:tcPr>
           <w:p>
             <w:pPr>
@@ -1434,7 +1434,7 @@
         </w:tc>
         <w:tc>
           <w:tcPr>
-            <w:tcW w:type="dxa" w:w="2300"/>
+            <w:tcW w:type="dxa" w:w="2625"/>
           </w:tcPr>
           <w:p>
             <w:pPr>
@@ -1477,7 +1477,7 @@
         </w:tc>
         <w:tc>
           <w:tcPr>
-            <w:tcW w:type="dxa" w:w="3460"/>
+            <w:tcW w:type="dxa" w:w="3949"/>
           </w:tcPr>
           <w:p>
             <w:pPr>
@@ -1498,7 +1498,7 @@
         </w:tc>
         <w:tc>
           <w:tcPr>
-            <w:tcW w:type="dxa" w:w="800"/>
+            <w:tcW w:type="dxa" w:w="913"/>
           </w:tcPr>
           <w:p>
             <w:pPr>
@@ -1515,7 +1515,7 @@
         </w:tc>
         <w:tc>
           <w:tcPr>
-            <w:tcW w:type="dxa" w:w="3400"/>
+            <w:tcW w:type="dxa" w:w="3880"/>
           </w:tcPr>
           <w:p>
             <w:pPr>
@@ -1532,7 +1532,7 @@
         </w:tc>
         <w:tc>
           <w:tcPr>
-            <w:tcW w:type="dxa" w:w="2700"/>
+            <w:tcW w:type="dxa" w:w="3081"/>
           </w:tcPr>
           <w:p>
             <w:pPr>
@@ -1549,7 +1549,7 @@
         </w:tc>
         <w:tc>
           <w:tcPr>
-            <w:tcW w:type="dxa" w:w="1861"/>
+            <w:tcW w:type="dxa" w:w="2124"/>
           </w:tcPr>
           <w:p>
             <w:pPr>
@@ -1571,7 +1571,7 @@
         </w:trPr>
         <w:tc>
           <w:tcPr>
-            <w:tcW w:type="dxa" w:w="620"/>
+            <w:tcW w:type="dxa" w:w="708"/>
           </w:tcPr>
           <w:p>
             <w:pPr>
@@ -1590,7 +1590,7 @@
         </w:tc>
         <w:tc>
           <w:tcPr>
-            <w:tcW w:type="dxa" w:w="2300"/>
+            <w:tcW w:type="dxa" w:w="2625"/>
           </w:tcPr>
           <w:p>
             <w:pPr>
@@ -1633,7 +1633,7 @@
         </w:tc>
         <w:tc>
           <w:tcPr>
-            <w:tcW w:type="dxa" w:w="3460"/>
+            <w:tcW w:type="dxa" w:w="3949"/>
           </w:tcPr>
           <w:p>
             <w:pPr>
@@ -1654,7 +1654,7 @@
         </w:tc>
         <w:tc>
           <w:tcPr>
-            <w:tcW w:type="dxa" w:w="800"/>
+            <w:tcW w:type="dxa" w:w="913"/>
           </w:tcPr>
           <w:p>
             <w:pPr>
@@ -1671,7 +1671,7 @@
         </w:tc>
         <w:tc>
           <w:tcPr>
-            <w:tcW w:type="dxa" w:w="3400"/>
+            <w:tcW w:type="dxa" w:w="3880"/>
           </w:tcPr>
           <w:p>
             <w:pPr>
@@ -1688,7 +1688,7 @@
         </w:tc>
         <w:tc>
           <w:tcPr>
-            <w:tcW w:type="dxa" w:w="2700"/>
+            <w:tcW w:type="dxa" w:w="3081"/>
           </w:tcPr>
           <w:p>
             <w:pPr>
@@ -1705,7 +1705,7 @@
         </w:tc>
         <w:tc>
           <w:tcPr>
-            <w:tcW w:type="dxa" w:w="1861"/>
+            <w:tcW w:type="dxa" w:w="2124"/>
           </w:tcPr>
           <w:p>
             <w:pPr>
@@ -1727,7 +1727,7 @@
         </w:trPr>
         <w:tc>
           <w:tcPr>
-            <w:tcW w:type="dxa" w:w="620"/>
+            <w:tcW w:type="dxa" w:w="708"/>
           </w:tcPr>
           <w:p>
             <w:pPr>
@@ -1746,7 +1746,7 @@
         </w:tc>
         <w:tc>
           <w:tcPr>
-            <w:tcW w:type="dxa" w:w="2300"/>
+            <w:tcW w:type="dxa" w:w="2625"/>
           </w:tcPr>
           <w:p>
             <w:pPr>
@@ -1789,7 +1789,7 @@
         </w:tc>
         <w:tc>
           <w:tcPr>
-            <w:tcW w:type="dxa" w:w="3460"/>
+            <w:tcW w:type="dxa" w:w="3949"/>
           </w:tcPr>
           <w:p>
             <w:pPr>
@@ -1808,7 +1808,7 @@
         </w:tc>
         <w:tc>
           <w:tcPr>
-            <w:tcW w:type="dxa" w:w="800"/>
+            <w:tcW w:type="dxa" w:w="913"/>
           </w:tcPr>
           <w:p>
             <w:pPr>
@@ -1825,7 +1825,7 @@
         </w:tc>
         <w:tc>
           <w:tcPr>
-            <w:tcW w:type="dxa" w:w="3400"/>
+            <w:tcW w:type="dxa" w:w="3880"/>
           </w:tcPr>
           <w:p>
             <w:pPr>
@@ -1842,7 +1842,7 @@
         </w:tc>
         <w:tc>
           <w:tcPr>
-            <w:tcW w:type="dxa" w:w="2700"/>
+            <w:tcW w:type="dxa" w:w="3081"/>
           </w:tcPr>
           <w:p>
             <w:pPr>
@@ -1859,7 +1859,7 @@
         </w:tc>
         <w:tc>
           <w:tcPr>
-            <w:tcW w:type="dxa" w:w="1861"/>
+            <w:tcW w:type="dxa" w:w="2124"/>
           </w:tcPr>
           <w:p>
             <w:pPr>
@@ -1881,7 +1881,7 @@
         </w:trPr>
         <w:tc>
           <w:tcPr>
-            <w:tcW w:type="dxa" w:w="620"/>
+            <w:tcW w:type="dxa" w:w="708"/>
           </w:tcPr>
           <w:p>
             <w:pPr>
@@ -1900,7 +1900,7 @@
         </w:tc>
         <w:tc>
           <w:tcPr>
-            <w:tcW w:type="dxa" w:w="2300"/>
+            <w:tcW w:type="dxa" w:w="2625"/>
           </w:tcPr>
           <w:p>
             <w:pPr>
@@ -1943,7 +1943,7 @@
         </w:tc>
         <w:tc>
           <w:tcPr>
-            <w:tcW w:type="dxa" w:w="3460"/>
+            <w:tcW w:type="dxa" w:w="3949"/>
           </w:tcPr>
           <w:p>
             <w:pPr>
@@ -1964,7 +1964,7 @@
         </w:tc>
         <w:tc>
           <w:tcPr>
-            <w:tcW w:type="dxa" w:w="800"/>
+            <w:tcW w:type="dxa" w:w="913"/>
           </w:tcPr>
           <w:p>
             <w:pPr>
@@ -1981,7 +1981,7 @@
         </w:tc>
         <w:tc>
           <w:tcPr>
-            <w:tcW w:type="dxa" w:w="3400"/>
+            <w:tcW w:type="dxa" w:w="3880"/>
           </w:tcPr>
           <w:p>
             <w:pPr>
@@ -1998,7 +1998,7 @@
         </w:tc>
         <w:tc>
           <w:tcPr>
-            <w:tcW w:type="dxa" w:w="2700"/>
+            <w:tcW w:type="dxa" w:w="3081"/>
           </w:tcPr>
           <w:p>
             <w:pPr>
@@ -2015,7 +2015,7 @@
         </w:tc>
         <w:tc>
           <w:tcPr>
-            <w:tcW w:type="dxa" w:w="1861"/>
+            <w:tcW w:type="dxa" w:w="2124"/>
           </w:tcPr>
           <w:p>
             <w:pPr>
@@ -2037,7 +2037,7 @@
         </w:trPr>
         <w:tc>
           <w:tcPr>
-            <w:tcW w:type="dxa" w:w="620"/>
+            <w:tcW w:type="dxa" w:w="708"/>
           </w:tcPr>
           <w:p>
             <w:pPr>
@@ -2056,7 +2056,7 @@
         </w:tc>
         <w:tc>
           <w:tcPr>
-            <w:tcW w:type="dxa" w:w="2300"/>
+            <w:tcW w:type="dxa" w:w="2625"/>
           </w:tcPr>
           <w:p>
             <w:pPr>
@@ -2099,7 +2099,7 @@
         </w:tc>
         <w:tc>
           <w:tcPr>
-            <w:tcW w:type="dxa" w:w="3460"/>
+            <w:tcW w:type="dxa" w:w="3949"/>
           </w:tcPr>
           <w:p>
             <w:pPr>
@@ -2120,7 +2120,7 @@
         </w:tc>
         <w:tc>
           <w:tcPr>
-            <w:tcW w:type="dxa" w:w="800"/>
+            <w:tcW w:type="dxa" w:w="913"/>
           </w:tcPr>
           <w:p>
             <w:pPr>
@@ -2137,7 +2137,7 @@
         </w:tc>
         <w:tc>
           <w:tcPr>
-            <w:tcW w:type="dxa" w:w="3400"/>
+            <w:tcW w:type="dxa" w:w="3880"/>
           </w:tcPr>
           <w:p>
             <w:pPr>
@@ -2154,7 +2154,7 @@
         </w:tc>
         <w:tc>
           <w:tcPr>
-            <w:tcW w:type="dxa" w:w="2700"/>
+            <w:tcW w:type="dxa" w:w="3081"/>
           </w:tcPr>
           <w:p>
             <w:pPr>
@@ -2171,7 +2171,7 @@
         </w:tc>
         <w:tc>
           <w:tcPr>
-            <w:tcW w:type="dxa" w:w="1861"/>
+            <w:tcW w:type="dxa" w:w="2124"/>
           </w:tcPr>
           <w:p>
             <w:pPr>
@@ -2193,7 +2193,7 @@
         </w:trPr>
         <w:tc>
           <w:tcPr>
-            <w:tcW w:type="dxa" w:w="620"/>
+            <w:tcW w:type="dxa" w:w="708"/>
           </w:tcPr>
           <w:p>
             <w:pPr>
@@ -2212,7 +2212,7 @@
         </w:tc>
         <w:tc>
           <w:tcPr>
-            <w:tcW w:type="dxa" w:w="2300"/>
+            <w:tcW w:type="dxa" w:w="2625"/>
           </w:tcPr>
           <w:p>
             <w:pPr>
@@ -2268,7 +2268,7 @@
         </w:tc>
         <w:tc>
           <w:tcPr>
-            <w:tcW w:type="dxa" w:w="3460"/>
+            <w:tcW w:type="dxa" w:w="3949"/>
           </w:tcPr>
           <w:p>
             <w:pPr>
@@ -2289,7 +2289,7 @@
         </w:tc>
         <w:tc>
           <w:tcPr>
-            <w:tcW w:type="dxa" w:w="800"/>
+            <w:tcW w:type="dxa" w:w="913"/>
           </w:tcPr>
           <w:p>
             <w:pPr>
@@ -2306,7 +2306,7 @@
         </w:tc>
         <w:tc>
           <w:tcPr>
-            <w:tcW w:type="dxa" w:w="3400"/>
+            <w:tcW w:type="dxa" w:w="3880"/>
           </w:tcPr>
           <w:p>
             <w:pPr>
@@ -2323,7 +2323,7 @@
         </w:tc>
         <w:tc>
           <w:tcPr>
-            <w:tcW w:type="dxa" w:w="2700"/>
+            <w:tcW w:type="dxa" w:w="3081"/>
           </w:tcPr>
           <w:p>
             <w:pPr>
@@ -2340,7 +2340,7 @@
         </w:tc>
         <w:tc>
           <w:tcPr>
-            <w:tcW w:type="dxa" w:w="1861"/>
+            <w:tcW w:type="dxa" w:w="2124"/>
           </w:tcPr>
           <w:p>
             <w:pPr>
@@ -2362,7 +2362,7 @@
         </w:trPr>
         <w:tc>
           <w:tcPr>
-            <w:tcW w:type="dxa" w:w="620"/>
+            <w:tcW w:type="dxa" w:w="708"/>
           </w:tcPr>
           <w:p>
             <w:pPr>
@@ -2381,7 +2381,7 @@
         </w:tc>
         <w:tc>
           <w:tcPr>
-            <w:tcW w:type="dxa" w:w="2300"/>
+            <w:tcW w:type="dxa" w:w="2625"/>
           </w:tcPr>
           <w:p>
             <w:pPr>
@@ -2424,7 +2424,7 @@
         </w:tc>
         <w:tc>
           <w:tcPr>
-            <w:tcW w:type="dxa" w:w="3460"/>
+            <w:tcW w:type="dxa" w:w="3949"/>
           </w:tcPr>
           <w:p>
             <w:pPr>
@@ -2445,7 +2445,7 @@
         </w:tc>
         <w:tc>
           <w:tcPr>
-            <w:tcW w:type="dxa" w:w="800"/>
+            <w:tcW w:type="dxa" w:w="913"/>
           </w:tcPr>
           <w:p>
             <w:pPr>
@@ -2462,7 +2462,7 @@
         </w:tc>
         <w:tc>
           <w:tcPr>
-            <w:tcW w:type="dxa" w:w="3400"/>
+            <w:tcW w:type="dxa" w:w="3880"/>
           </w:tcPr>
           <w:p>
             <w:pPr>
@@ -2479,7 +2479,7 @@
         </w:tc>
         <w:tc>
           <w:tcPr>
-            <w:tcW w:type="dxa" w:w="2700"/>
+            <w:tcW w:type="dxa" w:w="3081"/>
           </w:tcPr>
           <w:p>
             <w:pPr>
@@ -2496,7 +2496,7 @@
         </w:tc>
         <w:tc>
           <w:tcPr>
-            <w:tcW w:type="dxa" w:w="1861"/>
+            <w:tcW w:type="dxa" w:w="2124"/>
           </w:tcPr>
           <w:p>
             <w:pPr>
@@ -2518,7 +2518,7 @@
         </w:trPr>
         <w:tc>
           <w:tcPr>
-            <w:tcW w:type="dxa" w:w="620"/>
+            <w:tcW w:type="dxa" w:w="708"/>
           </w:tcPr>
           <w:p>
             <w:pPr>
@@ -2537,7 +2537,7 @@
         </w:tc>
         <w:tc>
           <w:tcPr>
-            <w:tcW w:type="dxa" w:w="2300"/>
+            <w:tcW w:type="dxa" w:w="2625"/>
           </w:tcPr>
           <w:p>
             <w:pPr>
@@ -2619,7 +2619,7 @@
         </w:tc>
         <w:tc>
           <w:tcPr>
-            <w:tcW w:type="dxa" w:w="3460"/>
+            <w:tcW w:type="dxa" w:w="3949"/>
           </w:tcPr>
           <w:p>
             <w:pPr>
@@ -2636,7 +2636,7 @@
         </w:tc>
         <w:tc>
           <w:tcPr>
-            <w:tcW w:type="dxa" w:w="800"/>
+            <w:tcW w:type="dxa" w:w="913"/>
           </w:tcPr>
           <w:p>
             <w:pPr>
@@ -2653,7 +2653,7 @@
         </w:tc>
         <w:tc>
           <w:tcPr>
-            <w:tcW w:type="dxa" w:w="3400"/>
+            <w:tcW w:type="dxa" w:w="3880"/>
           </w:tcPr>
           <w:p>
             <w:pPr>
@@ -2670,7 +2670,7 @@
         </w:tc>
         <w:tc>
           <w:tcPr>
-            <w:tcW w:type="dxa" w:w="2700"/>
+            <w:tcW w:type="dxa" w:w="3081"/>
           </w:tcPr>
           <w:p>
             <w:pPr>
@@ -2687,7 +2687,7 @@
         </w:tc>
         <w:tc>
           <w:tcPr>
-            <w:tcW w:type="dxa" w:w="1861"/>
+            <w:tcW w:type="dxa" w:w="2124"/>
           </w:tcPr>
           <w:p>
             <w:pPr>
@@ -2709,7 +2709,7 @@
         </w:trPr>
         <w:tc>
           <w:tcPr>
-            <w:tcW w:type="dxa" w:w="620"/>
+            <w:tcW w:type="dxa" w:w="708"/>
           </w:tcPr>
           <w:p>
             <w:pPr>
@@ -2728,7 +2728,7 @@
         </w:tc>
         <w:tc>
           <w:tcPr>
-            <w:tcW w:type="dxa" w:w="2300"/>
+            <w:tcW w:type="dxa" w:w="2625"/>
           </w:tcPr>
           <w:p>
             <w:pPr>
@@ -2849,7 +2849,7 @@
         </w:tc>
         <w:tc>
           <w:tcPr>
-            <w:tcW w:type="dxa" w:w="3460"/>
+            <w:tcW w:type="dxa" w:w="3949"/>
           </w:tcPr>
           <w:p>
             <w:pPr>
@@ -2866,7 +2866,7 @@
         </w:tc>
         <w:tc>
           <w:tcPr>
-            <w:tcW w:type="dxa" w:w="800"/>
+            <w:tcW w:type="dxa" w:w="913"/>
           </w:tcPr>
           <w:p>
             <w:pPr>
@@ -2883,7 +2883,7 @@
         </w:tc>
         <w:tc>
           <w:tcPr>
-            <w:tcW w:type="dxa" w:w="3400"/>
+            <w:tcW w:type="dxa" w:w="3880"/>
           </w:tcPr>
           <w:p>
             <w:pPr>
@@ -2900,7 +2900,7 @@
         </w:tc>
         <w:tc>
           <w:tcPr>
-            <w:tcW w:type="dxa" w:w="2700"/>
+            <w:tcW w:type="dxa" w:w="3081"/>
           </w:tcPr>
           <w:p>
             <w:pPr>
@@ -2917,7 +2917,7 @@
         </w:tc>
         <w:tc>
           <w:tcPr>
-            <w:tcW w:type="dxa" w:w="1861"/>
+            <w:tcW w:type="dxa" w:w="2124"/>
           </w:tcPr>
           <w:p>
             <w:pPr>
@@ -2939,7 +2939,7 @@
         </w:trPr>
         <w:tc>
           <w:tcPr>
-            <w:tcW w:type="dxa" w:w="620"/>
+            <w:tcW w:type="dxa" w:w="708"/>
           </w:tcPr>
           <w:p>
             <w:pPr>
@@ -2958,7 +2958,7 @@
         </w:tc>
         <w:tc>
           <w:tcPr>
-            <w:tcW w:type="dxa" w:w="2300"/>
+            <w:tcW w:type="dxa" w:w="2625"/>
           </w:tcPr>
           <w:p>
             <w:pPr>
@@ -3079,7 +3079,7 @@
         </w:tc>
         <w:tc>
           <w:tcPr>
-            <w:tcW w:type="dxa" w:w="3460"/>
+            <w:tcW w:type="dxa" w:w="3949"/>
           </w:tcPr>
           <w:p>
             <w:pPr>
@@ -3096,7 +3096,7 @@
         </w:tc>
         <w:tc>
           <w:tcPr>
-            <w:tcW w:type="dxa" w:w="800"/>
+            <w:tcW w:type="dxa" w:w="913"/>
           </w:tcPr>
           <w:p>
             <w:pPr>
@@ -3113,7 +3113,7 @@
         </w:tc>
         <w:tc>
           <w:tcPr>
-            <w:tcW w:type="dxa" w:w="3400"/>
+            <w:tcW w:type="dxa" w:w="3880"/>
           </w:tcPr>
           <w:p>
             <w:pPr>
@@ -3130,7 +3130,7 @@
         </w:tc>
         <w:tc>
           <w:tcPr>
-            <w:tcW w:type="dxa" w:w="2700"/>
+            <w:tcW w:type="dxa" w:w="3081"/>
           </w:tcPr>
           <w:p>
             <w:pPr>
@@ -3147,7 +3147,7 @@
         </w:tc>
         <w:tc>
           <w:tcPr>
-            <w:tcW w:type="dxa" w:w="1861"/>
+            <w:tcW w:type="dxa" w:w="2124"/>
           </w:tcPr>
           <w:p>
             <w:pPr>
@@ -3169,7 +3169,7 @@
         </w:trPr>
         <w:tc>
           <w:tcPr>
-            <w:tcW w:type="dxa" w:w="620"/>
+            <w:tcW w:type="dxa" w:w="708"/>
           </w:tcPr>
           <w:p>
             <w:pPr>
@@ -3188,7 +3188,7 @@
         </w:tc>
         <w:tc>
           <w:tcPr>
-            <w:tcW w:type="dxa" w:w="2300"/>
+            <w:tcW w:type="dxa" w:w="2625"/>
           </w:tcPr>
           <w:p>
             <w:pPr>
@@ -3231,7 +3231,7 @@
         </w:tc>
         <w:tc>
           <w:tcPr>
-            <w:tcW w:type="dxa" w:w="3460"/>
+            <w:tcW w:type="dxa" w:w="3949"/>
           </w:tcPr>
           <w:p>
             <w:pPr>
@@ -3248,7 +3248,7 @@
         </w:tc>
         <w:tc>
           <w:tcPr>
-            <w:tcW w:type="dxa" w:w="800"/>
+            <w:tcW w:type="dxa" w:w="913"/>
           </w:tcPr>
           <w:p>
             <w:pPr>
@@ -3265,7 +3265,7 @@
         </w:tc>
         <w:tc>
           <w:tcPr>
-            <w:tcW w:type="dxa" w:w="3400"/>
+            <w:tcW w:type="dxa" w:w="3880"/>
           </w:tcPr>
           <w:p>
             <w:pPr>
@@ -3282,7 +3282,7 @@
         </w:tc>
         <w:tc>
           <w:tcPr>
-            <w:tcW w:type="dxa" w:w="2700"/>
+            <w:tcW w:type="dxa" w:w="3081"/>
           </w:tcPr>
           <w:p>
             <w:pPr>
@@ -3299,7 +3299,7 @@
         </w:tc>
         <w:tc>
           <w:tcPr>
-            <w:tcW w:type="dxa" w:w="1861"/>
+            <w:tcW w:type="dxa" w:w="2124"/>
           </w:tcPr>
           <w:p>
             <w:pPr>
@@ -3321,7 +3321,7 @@
         </w:trPr>
         <w:tc>
           <w:tcPr>
-            <w:tcW w:type="dxa" w:w="15141"/>
+            <w:tcW w:type="dxa" w:w="17280"/>
             <w:gridSpan w:val="7"/>
             <w:shd w:val="clear" w:color="auto" w:fill="2E7D32"/>
           </w:tcPr>
@@ -3347,7 +3347,7 @@
         </w:trPr>
         <w:tc>
           <w:tcPr>
-            <w:tcW w:type="dxa" w:w="15141"/>
+            <w:tcW w:type="dxa" w:w="17280"/>
             <w:gridSpan w:val="7"/>
             <w:shd w:val="clear" w:color="auto" w:fill="E8F5E9"/>
           </w:tcPr>
@@ -3373,7 +3373,7 @@
         </w:trPr>
         <w:tc>
           <w:tcPr>
-            <w:tcW w:type="dxa" w:w="620"/>
+            <w:tcW w:type="dxa" w:w="708"/>
           </w:tcPr>
           <w:p>
             <w:pPr>
@@ -3392,7 +3392,7 @@
         </w:tc>
         <w:tc>
           <w:tcPr>
-            <w:tcW w:type="dxa" w:w="2300"/>
+            <w:tcW w:type="dxa" w:w="2625"/>
           </w:tcPr>
           <w:p>
             <w:pPr>
@@ -3435,7 +3435,7 @@
         </w:tc>
         <w:tc>
           <w:tcPr>
-            <w:tcW w:type="dxa" w:w="3460"/>
+            <w:tcW w:type="dxa" w:w="3949"/>
           </w:tcPr>
           <w:p>
             <w:pPr>
@@ -3456,7 +3456,7 @@
         </w:tc>
         <w:tc>
           <w:tcPr>
-            <w:tcW w:type="dxa" w:w="800"/>
+            <w:tcW w:type="dxa" w:w="913"/>
           </w:tcPr>
           <w:p>
             <w:pPr>
@@ -3473,7 +3473,7 @@
         </w:tc>
         <w:tc>
           <w:tcPr>
-            <w:tcW w:type="dxa" w:w="3400"/>
+            <w:tcW w:type="dxa" w:w="3880"/>
           </w:tcPr>
           <w:p>
             <w:pPr>
@@ -3490,7 +3490,7 @@
         </w:tc>
         <w:tc>
           <w:tcPr>
-            <w:tcW w:type="dxa" w:w="2700"/>
+            <w:tcW w:type="dxa" w:w="3081"/>
           </w:tcPr>
           <w:p>
             <w:pPr>
@@ -3507,7 +3507,7 @@
         </w:tc>
         <w:tc>
           <w:tcPr>
-            <w:tcW w:type="dxa" w:w="1861"/>
+            <w:tcW w:type="dxa" w:w="2124"/>
           </w:tcPr>
           <w:p>
             <w:pPr>
@@ -3529,7 +3529,7 @@
         </w:trPr>
         <w:tc>
           <w:tcPr>
-            <w:tcW w:type="dxa" w:w="620"/>
+            <w:tcW w:type="dxa" w:w="708"/>
           </w:tcPr>
           <w:p>
             <w:pPr>
@@ -3548,7 +3548,7 @@
         </w:tc>
         <w:tc>
           <w:tcPr>
-            <w:tcW w:type="dxa" w:w="2300"/>
+            <w:tcW w:type="dxa" w:w="2625"/>
           </w:tcPr>
           <w:p>
             <w:pPr>
@@ -3604,7 +3604,7 @@
         </w:tc>
         <w:tc>
           <w:tcPr>
-            <w:tcW w:type="dxa" w:w="3460"/>
+            <w:tcW w:type="dxa" w:w="3949"/>
           </w:tcPr>
           <w:p>
             <w:pPr>
@@ -3625,7 +3625,7 @@
         </w:tc>
         <w:tc>
           <w:tcPr>
-            <w:tcW w:type="dxa" w:w="800"/>
+            <w:tcW w:type="dxa" w:w="913"/>
           </w:tcPr>
           <w:p>
             <w:pPr>
@@ -3642,7 +3642,7 @@
         </w:tc>
         <w:tc>
           <w:tcPr>
-            <w:tcW w:type="dxa" w:w="3400"/>
+            <w:tcW w:type="dxa" w:w="3880"/>
           </w:tcPr>
           <w:p>
             <w:pPr>
@@ -3659,7 +3659,7 @@
         </w:tc>
         <w:tc>
           <w:tcPr>
-            <w:tcW w:type="dxa" w:w="2700"/>
+            <w:tcW w:type="dxa" w:w="3081"/>
           </w:tcPr>
           <w:p>
             <w:pPr>
@@ -3676,7 +3676,7 @@
         </w:tc>
         <w:tc>
           <w:tcPr>
-            <w:tcW w:type="dxa" w:w="1861"/>
+            <w:tcW w:type="dxa" w:w="2124"/>
           </w:tcPr>
           <w:p>
             <w:pPr>
@@ -3698,7 +3698,7 @@
         </w:trPr>
         <w:tc>
           <w:tcPr>
-            <w:tcW w:type="dxa" w:w="620"/>
+            <w:tcW w:type="dxa" w:w="708"/>
           </w:tcPr>
           <w:p>
             <w:pPr>
@@ -3717,7 +3717,7 @@
         </w:tc>
         <w:tc>
           <w:tcPr>
-            <w:tcW w:type="dxa" w:w="2300"/>
+            <w:tcW w:type="dxa" w:w="2625"/>
           </w:tcPr>
           <w:p>
             <w:pPr>
@@ -3760,7 +3760,7 @@
         </w:tc>
         <w:tc>
           <w:tcPr>
-            <w:tcW w:type="dxa" w:w="3460"/>
+            <w:tcW w:type="dxa" w:w="3949"/>
           </w:tcPr>
           <w:p>
             <w:pPr>
@@ -3779,7 +3779,7 @@
         </w:tc>
         <w:tc>
           <w:tcPr>
-            <w:tcW w:type="dxa" w:w="800"/>
+            <w:tcW w:type="dxa" w:w="913"/>
           </w:tcPr>
           <w:p>
             <w:pPr>
@@ -3796,7 +3796,7 @@
         </w:tc>
         <w:tc>
           <w:tcPr>
-            <w:tcW w:type="dxa" w:w="3400"/>
+            <w:tcW w:type="dxa" w:w="3880"/>
           </w:tcPr>
           <w:p>
             <w:pPr>
@@ -3813,7 +3813,7 @@
         </w:tc>
         <w:tc>
           <w:tcPr>
-            <w:tcW w:type="dxa" w:w="2700"/>
+            <w:tcW w:type="dxa" w:w="3081"/>
           </w:tcPr>
           <w:p>
             <w:pPr>
@@ -3830,7 +3830,7 @@
         </w:tc>
         <w:tc>
           <w:tcPr>
-            <w:tcW w:type="dxa" w:w="1861"/>
+            <w:tcW w:type="dxa" w:w="2124"/>
           </w:tcPr>
           <w:p>
             <w:pPr>
@@ -3852,7 +3852,7 @@
         </w:trPr>
         <w:tc>
           <w:tcPr>
-            <w:tcW w:type="dxa" w:w="620"/>
+            <w:tcW w:type="dxa" w:w="708"/>
           </w:tcPr>
           <w:p>
             <w:pPr>
@@ -3871,7 +3871,7 @@
         </w:tc>
         <w:tc>
           <w:tcPr>
-            <w:tcW w:type="dxa" w:w="2300"/>
+            <w:tcW w:type="dxa" w:w="2625"/>
           </w:tcPr>
           <w:p>
             <w:pPr>
@@ -3927,7 +3927,7 @@
         </w:tc>
         <w:tc>
           <w:tcPr>
-            <w:tcW w:type="dxa" w:w="3460"/>
+            <w:tcW w:type="dxa" w:w="3949"/>
           </w:tcPr>
           <w:p>
             <w:pPr>
@@ -3948,7 +3948,7 @@
         </w:tc>
         <w:tc>
           <w:tcPr>
-            <w:tcW w:type="dxa" w:w="800"/>
+            <w:tcW w:type="dxa" w:w="913"/>
           </w:tcPr>
           <w:p>
             <w:pPr>
@@ -3965,7 +3965,7 @@
         </w:tc>
         <w:tc>
           <w:tcPr>
-            <w:tcW w:type="dxa" w:w="3400"/>
+            <w:tcW w:type="dxa" w:w="3880"/>
           </w:tcPr>
           <w:p>
             <w:pPr>
@@ -3982,7 +3982,7 @@
         </w:tc>
         <w:tc>
           <w:tcPr>
-            <w:tcW w:type="dxa" w:w="2700"/>
+            <w:tcW w:type="dxa" w:w="3081"/>
           </w:tcPr>
           <w:p>
             <w:pPr>
@@ -3999,7 +3999,7 @@
         </w:tc>
         <w:tc>
           <w:tcPr>
-            <w:tcW w:type="dxa" w:w="1861"/>
+            <w:tcW w:type="dxa" w:w="2124"/>
           </w:tcPr>
           <w:p>
             <w:pPr>
@@ -4021,7 +4021,7 @@
         </w:trPr>
         <w:tc>
           <w:tcPr>
-            <w:tcW w:type="dxa" w:w="620"/>
+            <w:tcW w:type="dxa" w:w="708"/>
           </w:tcPr>
           <w:p>
             <w:pPr>
@@ -4040,7 +4040,7 @@
         </w:tc>
         <w:tc>
           <w:tcPr>
-            <w:tcW w:type="dxa" w:w="2300"/>
+            <w:tcW w:type="dxa" w:w="2625"/>
           </w:tcPr>
           <w:p>
             <w:pPr>
@@ -4083,7 +4083,7 @@
         </w:tc>
         <w:tc>
           <w:tcPr>
-            <w:tcW w:type="dxa" w:w="3460"/>
+            <w:tcW w:type="dxa" w:w="3949"/>
           </w:tcPr>
           <w:p>
             <w:pPr>
@@ -4104,7 +4104,7 @@
         </w:tc>
         <w:tc>
           <w:tcPr>
-            <w:tcW w:type="dxa" w:w="800"/>
+            <w:tcW w:type="dxa" w:w="913"/>
           </w:tcPr>
           <w:p>
             <w:pPr>
@@ -4121,7 +4121,7 @@
         </w:tc>
         <w:tc>
           <w:tcPr>
-            <w:tcW w:type="dxa" w:w="3400"/>
+            <w:tcW w:type="dxa" w:w="3880"/>
           </w:tcPr>
           <w:p>
             <w:pPr>
@@ -4138,7 +4138,7 @@
         </w:tc>
         <w:tc>
           <w:tcPr>
-            <w:tcW w:type="dxa" w:w="2700"/>
+            <w:tcW w:type="dxa" w:w="3081"/>
           </w:tcPr>
           <w:p>
             <w:pPr>
@@ -4155,7 +4155,7 @@
         </w:tc>
         <w:tc>
           <w:tcPr>
-            <w:tcW w:type="dxa" w:w="1861"/>
+            <w:tcW w:type="dxa" w:w="2124"/>
           </w:tcPr>
           <w:p>
             <w:pPr>
@@ -4177,7 +4177,7 @@
         </w:trPr>
         <w:tc>
           <w:tcPr>
-            <w:tcW w:type="dxa" w:w="620"/>
+            <w:tcW w:type="dxa" w:w="708"/>
           </w:tcPr>
           <w:p>
             <w:pPr>
@@ -4196,7 +4196,7 @@
         </w:tc>
         <w:tc>
           <w:tcPr>
-            <w:tcW w:type="dxa" w:w="2300"/>
+            <w:tcW w:type="dxa" w:w="2625"/>
           </w:tcPr>
           <w:p>
             <w:pPr>
@@ -4239,7 +4239,7 @@
         </w:tc>
         <w:tc>
           <w:tcPr>
-            <w:tcW w:type="dxa" w:w="3460"/>
+            <w:tcW w:type="dxa" w:w="3949"/>
           </w:tcPr>
           <w:p>
             <w:pPr>
@@ -4258,7 +4258,7 @@
         </w:tc>
         <w:tc>
           <w:tcPr>
-            <w:tcW w:type="dxa" w:w="800"/>
+            <w:tcW w:type="dxa" w:w="913"/>
           </w:tcPr>
           <w:p>
             <w:pPr>
@@ -4275,7 +4275,7 @@
         </w:tc>
         <w:tc>
           <w:tcPr>
-            <w:tcW w:type="dxa" w:w="3400"/>
+            <w:tcW w:type="dxa" w:w="3880"/>
           </w:tcPr>
           <w:p>
             <w:pPr>
@@ -4292,7 +4292,7 @@
         </w:tc>
         <w:tc>
           <w:tcPr>
-            <w:tcW w:type="dxa" w:w="2700"/>
+            <w:tcW w:type="dxa" w:w="3081"/>
           </w:tcPr>
           <w:p>
             <w:pPr>
@@ -4309,7 +4309,7 @@
         </w:tc>
         <w:tc>
           <w:tcPr>
-            <w:tcW w:type="dxa" w:w="1861"/>
+            <w:tcW w:type="dxa" w:w="2124"/>
           </w:tcPr>
           <w:p>
             <w:pPr>
@@ -4331,7 +4331,7 @@
         </w:trPr>
         <w:tc>
           <w:tcPr>
-            <w:tcW w:type="dxa" w:w="620"/>
+            <w:tcW w:type="dxa" w:w="708"/>
           </w:tcPr>
           <w:p>
             <w:pPr>
@@ -4350,7 +4350,7 @@
         </w:tc>
         <w:tc>
           <w:tcPr>
-            <w:tcW w:type="dxa" w:w="2300"/>
+            <w:tcW w:type="dxa" w:w="2625"/>
           </w:tcPr>
           <w:p>
             <w:pPr>
@@ -4393,7 +4393,7 @@
         </w:tc>
         <w:tc>
           <w:tcPr>
-            <w:tcW w:type="dxa" w:w="3460"/>
+            <w:tcW w:type="dxa" w:w="3949"/>
           </w:tcPr>
           <w:p>
             <w:pPr>
@@ -4414,7 +4414,7 @@
         </w:tc>
         <w:tc>
           <w:tcPr>
-            <w:tcW w:type="dxa" w:w="800"/>
+            <w:tcW w:type="dxa" w:w="913"/>
           </w:tcPr>
           <w:p>
             <w:pPr>
@@ -4431,7 +4431,7 @@
         </w:tc>
         <w:tc>
           <w:tcPr>
-            <w:tcW w:type="dxa" w:w="3400"/>
+            <w:tcW w:type="dxa" w:w="3880"/>
           </w:tcPr>
           <w:p>
             <w:pPr>
@@ -4448,7 +4448,7 @@
         </w:tc>
         <w:tc>
           <w:tcPr>
-            <w:tcW w:type="dxa" w:w="2700"/>
+            <w:tcW w:type="dxa" w:w="3081"/>
           </w:tcPr>
           <w:p>
             <w:pPr>
@@ -4465,7 +4465,7 @@
         </w:tc>
         <w:tc>
           <w:tcPr>
-            <w:tcW w:type="dxa" w:w="1861"/>
+            <w:tcW w:type="dxa" w:w="2124"/>
           </w:tcPr>
           <w:p>
             <w:pPr>
@@ -4487,7 +4487,7 @@
         </w:trPr>
         <w:tc>
           <w:tcPr>
-            <w:tcW w:type="dxa" w:w="620"/>
+            <w:tcW w:type="dxa" w:w="708"/>
           </w:tcPr>
           <w:p>
             <w:pPr>
@@ -4506,7 +4506,7 @@
         </w:tc>
         <w:tc>
           <w:tcPr>
-            <w:tcW w:type="dxa" w:w="2300"/>
+            <w:tcW w:type="dxa" w:w="2625"/>
           </w:tcPr>
           <w:p>
             <w:pPr>
@@ -4549,7 +4549,7 @@
         </w:tc>
         <w:tc>
           <w:tcPr>
-            <w:tcW w:type="dxa" w:w="3460"/>
+            <w:tcW w:type="dxa" w:w="3949"/>
           </w:tcPr>
           <w:p>
             <w:pPr>
@@ -4568,7 +4568,7 @@
         </w:tc>
         <w:tc>
           <w:tcPr>
-            <w:tcW w:type="dxa" w:w="800"/>
+            <w:tcW w:type="dxa" w:w="913"/>
           </w:tcPr>
           <w:p>
             <w:pPr>
@@ -4585,7 +4585,7 @@
         </w:tc>
         <w:tc>
           <w:tcPr>
-            <w:tcW w:type="dxa" w:w="3400"/>
+            <w:tcW w:type="dxa" w:w="3880"/>
           </w:tcPr>
           <w:p>
             <w:pPr>
@@ -4602,7 +4602,7 @@
         </w:tc>
         <w:tc>
           <w:tcPr>
-            <w:tcW w:type="dxa" w:w="2700"/>
+            <w:tcW w:type="dxa" w:w="3081"/>
           </w:tcPr>
           <w:p>
             <w:pPr>
@@ -4619,7 +4619,7 @@
         </w:tc>
         <w:tc>
           <w:tcPr>
-            <w:tcW w:type="dxa" w:w="1861"/>
+            <w:tcW w:type="dxa" w:w="2124"/>
           </w:tcPr>
           <w:p>
             <w:pPr>
@@ -4641,7 +4641,7 @@
         </w:trPr>
         <w:tc>
           <w:tcPr>
-            <w:tcW w:type="dxa" w:w="620"/>
+            <w:tcW w:type="dxa" w:w="708"/>
           </w:tcPr>
           <w:p>
             <w:pPr>
@@ -4660,7 +4660,7 @@
         </w:tc>
         <w:tc>
           <w:tcPr>
-            <w:tcW w:type="dxa" w:w="2300"/>
+            <w:tcW w:type="dxa" w:w="2625"/>
           </w:tcPr>
           <w:p>
             <w:pPr>
@@ -4703,7 +4703,7 @@
         </w:tc>
         <w:tc>
           <w:tcPr>
-            <w:tcW w:type="dxa" w:w="3460"/>
+            <w:tcW w:type="dxa" w:w="3949"/>
           </w:tcPr>
           <w:p>
             <w:pPr>
@@ -4724,7 +4724,7 @@
         </w:tc>
         <w:tc>
           <w:tcPr>
-            <w:tcW w:type="dxa" w:w="800"/>
+            <w:tcW w:type="dxa" w:w="913"/>
           </w:tcPr>
           <w:p>
             <w:pPr>
@@ -4741,7 +4741,7 @@
         </w:tc>
         <w:tc>
           <w:tcPr>
-            <w:tcW w:type="dxa" w:w="3400"/>
+            <w:tcW w:type="dxa" w:w="3880"/>
           </w:tcPr>
           <w:p>
             <w:pPr>
@@ -4758,7 +4758,7 @@
         </w:tc>
         <w:tc>
           <w:tcPr>
-            <w:tcW w:type="dxa" w:w="2700"/>
+            <w:tcW w:type="dxa" w:w="3081"/>
           </w:tcPr>
           <w:p>
             <w:pPr>
@@ -4775,7 +4775,7 @@
         </w:tc>
         <w:tc>
           <w:tcPr>
-            <w:tcW w:type="dxa" w:w="1861"/>
+            <w:tcW w:type="dxa" w:w="2124"/>
           </w:tcPr>
           <w:p>
             <w:pPr>
@@ -4797,7 +4797,7 @@
         </w:trPr>
         <w:tc>
           <w:tcPr>
-            <w:tcW w:type="dxa" w:w="620"/>
+            <w:tcW w:type="dxa" w:w="708"/>
           </w:tcPr>
           <w:p>
             <w:pPr>
@@ -4816,7 +4816,7 @@
         </w:tc>
         <w:tc>
           <w:tcPr>
-            <w:tcW w:type="dxa" w:w="2300"/>
+            <w:tcW w:type="dxa" w:w="2625"/>
           </w:tcPr>
           <w:p>
             <w:pPr>
@@ -4872,7 +4872,7 @@
         </w:tc>
         <w:tc>
           <w:tcPr>
-            <w:tcW w:type="dxa" w:w="3460"/>
+            <w:tcW w:type="dxa" w:w="3949"/>
           </w:tcPr>
           <w:p>
             <w:pPr>
@@ -4893,7 +4893,7 @@
         </w:tc>
         <w:tc>
           <w:tcPr>
-            <w:tcW w:type="dxa" w:w="800"/>
+            <w:tcW w:type="dxa" w:w="913"/>
           </w:tcPr>
           <w:p>
             <w:pPr>
@@ -4910,7 +4910,7 @@
         </w:tc>
         <w:tc>
           <w:tcPr>
-            <w:tcW w:type="dxa" w:w="3400"/>
+            <w:tcW w:type="dxa" w:w="3880"/>
           </w:tcPr>
           <w:p>
             <w:pPr>
@@ -4927,7 +4927,7 @@
         </w:tc>
         <w:tc>
           <w:tcPr>
-            <w:tcW w:type="dxa" w:w="2700"/>
+            <w:tcW w:type="dxa" w:w="3081"/>
           </w:tcPr>
           <w:p>
             <w:pPr>
@@ -4944,7 +4944,7 @@
         </w:tc>
         <w:tc>
           <w:tcPr>
-            <w:tcW w:type="dxa" w:w="1861"/>
+            <w:tcW w:type="dxa" w:w="2124"/>
           </w:tcPr>
           <w:p>
             <w:pPr>
@@ -4966,7 +4966,7 @@
         </w:trPr>
         <w:tc>
           <w:tcPr>
-            <w:tcW w:type="dxa" w:w="620"/>
+            <w:tcW w:type="dxa" w:w="708"/>
           </w:tcPr>
           <w:p>
             <w:pPr>
@@ -4985,7 +4985,7 @@
         </w:tc>
         <w:tc>
           <w:tcPr>
-            <w:tcW w:type="dxa" w:w="2300"/>
+            <w:tcW w:type="dxa" w:w="2625"/>
           </w:tcPr>
           <w:p>
             <w:pPr>
@@ -5132,7 +5132,7 @@
         </w:tc>
         <w:tc>
           <w:tcPr>
-            <w:tcW w:type="dxa" w:w="3460"/>
+            <w:tcW w:type="dxa" w:w="3949"/>
           </w:tcPr>
           <w:p>
             <w:pPr>
@@ -5149,7 +5149,7 @@
         </w:tc>
         <w:tc>
           <w:tcPr>
-            <w:tcW w:type="dxa" w:w="800"/>
+            <w:tcW w:type="dxa" w:w="913"/>
           </w:tcPr>
           <w:p>
             <w:pPr>
@@ -5166,7 +5166,7 @@
         </w:tc>
         <w:tc>
           <w:tcPr>
-            <w:tcW w:type="dxa" w:w="3400"/>
+            <w:tcW w:type="dxa" w:w="3880"/>
           </w:tcPr>
           <w:p>
             <w:pPr>
@@ -5183,7 +5183,7 @@
         </w:tc>
         <w:tc>
           <w:tcPr>
-            <w:tcW w:type="dxa" w:w="2700"/>
+            <w:tcW w:type="dxa" w:w="3081"/>
           </w:tcPr>
           <w:p>
             <w:pPr>
@@ -5200,7 +5200,7 @@
         </w:tc>
         <w:tc>
           <w:tcPr>
-            <w:tcW w:type="dxa" w:w="1861"/>
+            <w:tcW w:type="dxa" w:w="2124"/>
           </w:tcPr>
           <w:p>
             <w:pPr>
@@ -5222,7 +5222,7 @@
         </w:trPr>
         <w:tc>
           <w:tcPr>
-            <w:tcW w:type="dxa" w:w="620"/>
+            <w:tcW w:type="dxa" w:w="708"/>
           </w:tcPr>
           <w:p>
             <w:pPr>
@@ -5241,7 +5241,7 @@
         </w:tc>
         <w:tc>
           <w:tcPr>
-            <w:tcW w:type="dxa" w:w="2300"/>
+            <w:tcW w:type="dxa" w:w="2625"/>
           </w:tcPr>
           <w:p>
             <w:pPr>
@@ -5323,7 +5323,7 @@
         </w:tc>
         <w:tc>
           <w:tcPr>
-            <w:tcW w:type="dxa" w:w="3460"/>
+            <w:tcW w:type="dxa" w:w="3949"/>
           </w:tcPr>
           <w:p>
             <w:pPr>
@@ -5343,7 +5343,7 @@
         </w:tc>
         <w:tc>
           <w:tcPr>
-            <w:tcW w:type="dxa" w:w="800"/>
+            <w:tcW w:type="dxa" w:w="913"/>
           </w:tcPr>
           <w:p>
             <w:pPr>
@@ -5360,7 +5360,7 @@
         </w:tc>
         <w:tc>
           <w:tcPr>
-            <w:tcW w:type="dxa" w:w="3400"/>
+            <w:tcW w:type="dxa" w:w="3880"/>
           </w:tcPr>
           <w:p>
             <w:pPr>
@@ -5377,7 +5377,7 @@
         </w:tc>
         <w:tc>
           <w:tcPr>
-            <w:tcW w:type="dxa" w:w="2700"/>
+            <w:tcW w:type="dxa" w:w="3081"/>
           </w:tcPr>
           <w:p>
             <w:pPr>
@@ -5394,7 +5394,7 @@
         </w:tc>
         <w:tc>
           <w:tcPr>
-            <w:tcW w:type="dxa" w:w="1861"/>
+            <w:tcW w:type="dxa" w:w="2124"/>
           </w:tcPr>
           <w:p>
             <w:pPr>
@@ -5416,7 +5416,7 @@
         </w:trPr>
         <w:tc>
           <w:tcPr>
-            <w:tcW w:type="dxa" w:w="15141"/>
+            <w:tcW w:type="dxa" w:w="17280"/>
             <w:gridSpan w:val="7"/>
             <w:shd w:val="clear" w:color="auto" w:fill="E8F5E9"/>
           </w:tcPr>
@@ -5442,7 +5442,7 @@
         </w:trPr>
         <w:tc>
           <w:tcPr>
-            <w:tcW w:type="dxa" w:w="620"/>
+            <w:tcW w:type="dxa" w:w="708"/>
           </w:tcPr>
           <w:p>
             <w:pPr>
@@ -5461,7 +5461,7 @@
         </w:tc>
         <w:tc>
           <w:tcPr>
-            <w:tcW w:type="dxa" w:w="2300"/>
+            <w:tcW w:type="dxa" w:w="2625"/>
           </w:tcPr>
           <w:p>
             <w:pPr>
@@ -5517,7 +5517,7 @@
         </w:tc>
         <w:tc>
           <w:tcPr>
-            <w:tcW w:type="dxa" w:w="3460"/>
+            <w:tcW w:type="dxa" w:w="3949"/>
           </w:tcPr>
           <w:p>
             <w:pPr>
@@ -5538,7 +5538,7 @@
         </w:tc>
         <w:tc>
           <w:tcPr>
-            <w:tcW w:type="dxa" w:w="800"/>
+            <w:tcW w:type="dxa" w:w="913"/>
           </w:tcPr>
           <w:p>
             <w:pPr>
@@ -5555,7 +5555,7 @@
         </w:tc>
         <w:tc>
           <w:tcPr>
-            <w:tcW w:type="dxa" w:w="3400"/>
+            <w:tcW w:type="dxa" w:w="3880"/>
           </w:tcPr>
           <w:p>
             <w:pPr>
@@ -5572,7 +5572,7 @@
         </w:tc>
         <w:tc>
           <w:tcPr>
-            <w:tcW w:type="dxa" w:w="2700"/>
+            <w:tcW w:type="dxa" w:w="3081"/>
           </w:tcPr>
           <w:p>
             <w:pPr>
@@ -5589,7 +5589,7 @@
         </w:tc>
         <w:tc>
           <w:tcPr>
-            <w:tcW w:type="dxa" w:w="1861"/>
+            <w:tcW w:type="dxa" w:w="2124"/>
           </w:tcPr>
           <w:p>
             <w:pPr>
@@ -5611,7 +5611,7 @@
         </w:trPr>
         <w:tc>
           <w:tcPr>
-            <w:tcW w:type="dxa" w:w="620"/>
+            <w:tcW w:type="dxa" w:w="708"/>
           </w:tcPr>
           <w:p>
             <w:pPr>
@@ -5630,7 +5630,7 @@
         </w:tc>
         <w:tc>
           <w:tcPr>
-            <w:tcW w:type="dxa" w:w="2300"/>
+            <w:tcW w:type="dxa" w:w="2625"/>
           </w:tcPr>
           <w:p>
             <w:pPr>
@@ -5673,7 +5673,7 @@
         </w:tc>
         <w:tc>
           <w:tcPr>
-            <w:tcW w:type="dxa" w:w="3460"/>
+            <w:tcW w:type="dxa" w:w="3949"/>
           </w:tcPr>
           <w:p>
             <w:pPr>
@@ -5694,7 +5694,7 @@
         </w:tc>
         <w:tc>
           <w:tcPr>
-            <w:tcW w:type="dxa" w:w="800"/>
+            <w:tcW w:type="dxa" w:w="913"/>
           </w:tcPr>
           <w:p>
             <w:pPr>
@@ -5711,7 +5711,7 @@
         </w:tc>
         <w:tc>
           <w:tcPr>
-            <w:tcW w:type="dxa" w:w="3400"/>
+            <w:tcW w:type="dxa" w:w="3880"/>
           </w:tcPr>
           <w:p>
             <w:pPr>
@@ -5728,7 +5728,7 @@
         </w:tc>
         <w:tc>
           <w:tcPr>
-            <w:tcW w:type="dxa" w:w="2700"/>
+            <w:tcW w:type="dxa" w:w="3081"/>
           </w:tcPr>
           <w:p>
             <w:pPr>
@@ -5745,7 +5745,7 @@
         </w:tc>
         <w:tc>
           <w:tcPr>
-            <w:tcW w:type="dxa" w:w="1861"/>
+            <w:tcW w:type="dxa" w:w="2124"/>
           </w:tcPr>
           <w:p>
             <w:pPr>
@@ -5767,7 +5767,7 @@
         </w:trPr>
         <w:tc>
           <w:tcPr>
-            <w:tcW w:type="dxa" w:w="620"/>
+            <w:tcW w:type="dxa" w:w="708"/>
           </w:tcPr>
           <w:p>
             <w:pPr>
@@ -5786,7 +5786,7 @@
         </w:tc>
         <w:tc>
           <w:tcPr>
-            <w:tcW w:type="dxa" w:w="2300"/>
+            <w:tcW w:type="dxa" w:w="2625"/>
           </w:tcPr>
           <w:p>
             <w:pPr>
@@ -5829,7 +5829,7 @@
         </w:tc>
         <w:tc>
           <w:tcPr>
-            <w:tcW w:type="dxa" w:w="3460"/>
+            <w:tcW w:type="dxa" w:w="3949"/>
           </w:tcPr>
           <w:p>
             <w:pPr>
@@ -5850,7 +5850,7 @@
         </w:tc>
         <w:tc>
           <w:tcPr>
-            <w:tcW w:type="dxa" w:w="800"/>
+            <w:tcW w:type="dxa" w:w="913"/>
           </w:tcPr>
           <w:p>
             <w:pPr>
@@ -5867,7 +5867,7 @@
         </w:tc>
         <w:tc>
           <w:tcPr>
-            <w:tcW w:type="dxa" w:w="3400"/>
+            <w:tcW w:type="dxa" w:w="3880"/>
           </w:tcPr>
           <w:p>
             <w:pPr>
@@ -5884,7 +5884,7 @@
         </w:tc>
         <w:tc>
           <w:tcPr>
-            <w:tcW w:type="dxa" w:w="2700"/>
+            <w:tcW w:type="dxa" w:w="3081"/>
           </w:tcPr>
           <w:p>
             <w:pPr>
@@ -5901,7 +5901,7 @@
         </w:tc>
         <w:tc>
           <w:tcPr>
-            <w:tcW w:type="dxa" w:w="1861"/>
+            <w:tcW w:type="dxa" w:w="2124"/>
           </w:tcPr>
           <w:p>
             <w:pPr>
@@ -5923,7 +5923,7 @@
         </w:trPr>
         <w:tc>
           <w:tcPr>
-            <w:tcW w:type="dxa" w:w="620"/>
+            <w:tcW w:type="dxa" w:w="708"/>
           </w:tcPr>
           <w:p>
             <w:pPr>
@@ -5942,7 +5942,7 @@
         </w:tc>
         <w:tc>
           <w:tcPr>
-            <w:tcW w:type="dxa" w:w="2300"/>
+            <w:tcW w:type="dxa" w:w="2625"/>
           </w:tcPr>
           <w:p>
             <w:pPr>
@@ -5985,7 +5985,7 @@
         </w:tc>
         <w:tc>
           <w:tcPr>
-            <w:tcW w:type="dxa" w:w="3460"/>
+            <w:tcW w:type="dxa" w:w="3949"/>
           </w:tcPr>
           <w:p>
             <w:pPr>
@@ -6006,7 +6006,7 @@
         </w:tc>
         <w:tc>
           <w:tcPr>
-            <w:tcW w:type="dxa" w:w="800"/>
+            <w:tcW w:type="dxa" w:w="913"/>
           </w:tcPr>
           <w:p>
             <w:pPr>
@@ -6023,7 +6023,7 @@
         </w:tc>
         <w:tc>
           <w:tcPr>
-            <w:tcW w:type="dxa" w:w="3400"/>
+            <w:tcW w:type="dxa" w:w="3880"/>
           </w:tcPr>
           <w:p>
             <w:pPr>
@@ -6040,7 +6040,7 @@
         </w:tc>
         <w:tc>
           <w:tcPr>
-            <w:tcW w:type="dxa" w:w="2700"/>
+            <w:tcW w:type="dxa" w:w="3081"/>
           </w:tcPr>
           <w:p>
             <w:pPr>
@@ -6057,7 +6057,7 @@
         </w:tc>
         <w:tc>
           <w:tcPr>
-            <w:tcW w:type="dxa" w:w="1861"/>
+            <w:tcW w:type="dxa" w:w="2124"/>
           </w:tcPr>
           <w:p>
             <w:pPr>
@@ -6079,7 +6079,7 @@
         </w:trPr>
         <w:tc>
           <w:tcPr>
-            <w:tcW w:type="dxa" w:w="620"/>
+            <w:tcW w:type="dxa" w:w="708"/>
           </w:tcPr>
           <w:p>
             <w:pPr>
@@ -6098,7 +6098,7 @@
         </w:tc>
         <w:tc>
           <w:tcPr>
-            <w:tcW w:type="dxa" w:w="2300"/>
+            <w:tcW w:type="dxa" w:w="2625"/>
           </w:tcPr>
           <w:p>
             <w:pPr>
@@ -6167,7 +6167,7 @@
         </w:tc>
         <w:tc>
           <w:tcPr>
-            <w:tcW w:type="dxa" w:w="3460"/>
+            <w:tcW w:type="dxa" w:w="3949"/>
           </w:tcPr>
           <w:p>
             <w:pPr>
@@ -6184,7 +6184,7 @@
         </w:tc>
         <w:tc>
           <w:tcPr>
-            <w:tcW w:type="dxa" w:w="800"/>
+            <w:tcW w:type="dxa" w:w="913"/>
           </w:tcPr>
           <w:p>
             <w:pPr>
@@ -6201,7 +6201,7 @@
         </w:tc>
         <w:tc>
           <w:tcPr>
-            <w:tcW w:type="dxa" w:w="3400"/>
+            <w:tcW w:type="dxa" w:w="3880"/>
           </w:tcPr>
           <w:p>
             <w:pPr>
@@ -6218,7 +6218,7 @@
         </w:tc>
         <w:tc>
           <w:tcPr>
-            <w:tcW w:type="dxa" w:w="2700"/>
+            <w:tcW w:type="dxa" w:w="3081"/>
           </w:tcPr>
           <w:p>
             <w:pPr>
@@ -6235,7 +6235,7 @@
         </w:tc>
         <w:tc>
           <w:tcPr>
-            <w:tcW w:type="dxa" w:w="1861"/>
+            <w:tcW w:type="dxa" w:w="2124"/>
           </w:tcPr>
           <w:p>
             <w:pPr>
@@ -6257,7 +6257,7 @@
         </w:trPr>
         <w:tc>
           <w:tcPr>
-            <w:tcW w:type="dxa" w:w="620"/>
+            <w:tcW w:type="dxa" w:w="708"/>
           </w:tcPr>
           <w:p>
             <w:pPr>
@@ -6276,7 +6276,7 @@
         </w:tc>
         <w:tc>
           <w:tcPr>
-            <w:tcW w:type="dxa" w:w="2300"/>
+            <w:tcW w:type="dxa" w:w="2625"/>
           </w:tcPr>
           <w:p>
             <w:pPr>
@@ -6319,7 +6319,7 @@
         </w:tc>
         <w:tc>
           <w:tcPr>
-            <w:tcW w:type="dxa" w:w="3460"/>
+            <w:tcW w:type="dxa" w:w="3949"/>
           </w:tcPr>
           <w:p>
             <w:pPr>
@@ -6336,7 +6336,7 @@
         </w:tc>
         <w:tc>
           <w:tcPr>
-            <w:tcW w:type="dxa" w:w="800"/>
+            <w:tcW w:type="dxa" w:w="913"/>
           </w:tcPr>
           <w:p>
             <w:pPr>
@@ -6353,7 +6353,7 @@
         </w:tc>
         <w:tc>
           <w:tcPr>
-            <w:tcW w:type="dxa" w:w="3400"/>
+            <w:tcW w:type="dxa" w:w="3880"/>
           </w:tcPr>
           <w:p>
             <w:pPr>
@@ -6370,7 +6370,7 @@
         </w:tc>
         <w:tc>
           <w:tcPr>
-            <w:tcW w:type="dxa" w:w="2700"/>
+            <w:tcW w:type="dxa" w:w="3081"/>
           </w:tcPr>
           <w:p>
             <w:pPr>
@@ -6387,7 +6387,7 @@
         </w:tc>
         <w:tc>
           <w:tcPr>
-            <w:tcW w:type="dxa" w:w="1861"/>
+            <w:tcW w:type="dxa" w:w="2124"/>
           </w:tcPr>
           <w:p>
             <w:pPr>
@@ -6519,7 +6519,7 @@
     <w:sectPr>
       <w:footerReference w:type="default" r:id="rId9"/>
       <w:pgSz w:w="18720" w:h="12240" w:orient="landscape"/>
-      <w:pgMar w:top="850" w:right="850" w:bottom="850" w:left="850" w:header="720" w:footer="720" w:gutter="0"/>
+      <w:pgMar w:top="720" w:right="720" w:bottom="720" w:left="720" w:header="340" w:footer="340" w:gutter="0"/>
       <w:cols w:space="720"/>
       <w:docGrid w:linePitch="360"/>
     </w:sectPr>

</xml_diff>

<commit_message>
Software 1.º Esencial v3: capacidades MEC literales en las filas 18 y 36 del Plan Anual (H02) y sin pictogramas en Libro y Solucionario (H15)
- Plan Anual: filas 18 (7 capacidades) y 36 (13) transcriptas; 11 páginas, sin hoja casi vacía.
- Libro y Solucionario: 77 pictogramas quitados del texto; 107 y 17 páginas sin cambios; imágenes idénticas.
- Muestra rearmada (13 páginas, sin pictogramas).
- Controles v3 contra 558a335: 657 OK; contenido 117 OK; índices 61/65/36.

Co-Authored-By: Claude Opus 5.5 <noreply@anthropic.com>
Claude-Session: https://claude.ai/code/session_01LqBrALZn8HbnzzUtvCFRMa
</commit_message>
<xml_diff>
--- a/software_1_esencial/salida/Gabinete_Informatica_Software_1er_Curso_PLAN_ANUAL_COMERCIAL_2026.docx
+++ b/software_1_esencial/salida/Gabinete_Informatica_Software_1er_Curso_PLAN_ANUAL_COMERCIAL_2026.docx
@@ -3164,9 +3164,7 @@
         </w:tc>
       </w:tr>
       <w:tr>
-        <w:trPr>
-          <w:cantSplit/>
-        </w:trPr>
+        <w:trPr/>
         <w:tc>
           <w:tcPr>
             <w:tcW w:type="dxa" w:w="708"/>
@@ -3225,7 +3223,85 @@
                 <w:sz w:val="16"/>
                 <w:szCs w:val="16"/>
               </w:rPr>
-              <w:t xml:space="preserve">Todas las capacidades de la Unidad 1, transcriptas en las secuencias 1 a 15.</w:t>
+              <w:t xml:space="preserve">«Identifica las características principales de la Informática.»</w:t>
+            </w:r>
+          </w:p>
+          <w:p>
+            <w:pPr>
+              <w:spacing w:before="0" w:after="40" w:line="240" w:lineRule="auto"/>
+            </w:pPr>
+            <w:r>
+              <w:rPr>
+                <w:i/>
+                <w:sz w:val="16"/>
+                <w:szCs w:val="16"/>
+              </w:rPr>
+              <w:t xml:space="preserve">«Analiza los antecedentes históricos de la informática.»</w:t>
+            </w:r>
+          </w:p>
+          <w:p>
+            <w:pPr>
+              <w:spacing w:before="0" w:after="40" w:line="240" w:lineRule="auto"/>
+            </w:pPr>
+            <w:r>
+              <w:rPr>
+                <w:i/>
+                <w:sz w:val="16"/>
+                <w:szCs w:val="16"/>
+              </w:rPr>
+              <w:t xml:space="preserve">«Identifica los elementos básicos de la computadora.»</w:t>
+            </w:r>
+          </w:p>
+          <w:p>
+            <w:pPr>
+              <w:spacing w:before="0" w:after="40" w:line="240" w:lineRule="auto"/>
+            </w:pPr>
+            <w:r>
+              <w:rPr>
+                <w:i/>
+                <w:sz w:val="16"/>
+                <w:szCs w:val="16"/>
+              </w:rPr>
+              <w:t xml:space="preserve">«Reconoce las ventajas, desventajas, usos, aplicaciones y conexiones de las diferentes unidades de almacenamiento.»</w:t>
+            </w:r>
+          </w:p>
+          <w:p>
+            <w:pPr>
+              <w:spacing w:before="0" w:after="40" w:line="240" w:lineRule="auto"/>
+            </w:pPr>
+            <w:r>
+              <w:rPr>
+                <w:i/>
+                <w:sz w:val="16"/>
+                <w:szCs w:val="16"/>
+              </w:rPr>
+              <w:t xml:space="preserve">«Analiza las normas éticas y de seguridad vigentes en el ámbito informático.»</w:t>
+            </w:r>
+          </w:p>
+          <w:p>
+            <w:pPr>
+              <w:spacing w:before="0" w:after="40" w:line="240" w:lineRule="auto"/>
+            </w:pPr>
+            <w:r>
+              <w:rPr>
+                <w:i/>
+                <w:sz w:val="16"/>
+                <w:szCs w:val="16"/>
+              </w:rPr>
+              <w:t xml:space="preserve">«Analiza las características principales de los diferentes tipos de software.»</w:t>
+            </w:r>
+          </w:p>
+          <w:p>
+            <w:pPr>
+              <w:spacing w:before="0" w:after="40" w:line="240" w:lineRule="auto"/>
+            </w:pPr>
+            <w:r>
+              <w:rPr>
+                <w:i/>
+                <w:sz w:val="16"/>
+                <w:szCs w:val="16"/>
+              </w:rPr>
+              <w:t xml:space="preserve">«Reflexiona sobre las aplicaciones actuales de la informática.»</w:t>
             </w:r>
           </w:p>
         </w:tc>
@@ -6252,9 +6328,7 @@
         </w:tc>
       </w:tr>
       <w:tr>
-        <w:trPr>
-          <w:cantSplit/>
-        </w:trPr>
+        <w:trPr/>
         <w:tc>
           <w:tcPr>
             <w:tcW w:type="dxa" w:w="708"/>
@@ -6313,7 +6387,163 @@
                 <w:sz w:val="16"/>
                 <w:szCs w:val="16"/>
               </w:rPr>
-              <w:t xml:space="preserve">Todas las capacidades de las Unidades 2 y 3, transcriptas en las secuencias 19 a 34.</w:t>
+              <w:t xml:space="preserve">«Analiza el propósito y los objetivos de un sistema operativo.»</w:t>
+            </w:r>
+          </w:p>
+          <w:p>
+            <w:pPr>
+              <w:spacing w:before="0" w:after="40" w:line="240" w:lineRule="auto"/>
+            </w:pPr>
+            <w:r>
+              <w:rPr>
+                <w:i/>
+                <w:sz w:val="16"/>
+                <w:szCs w:val="16"/>
+              </w:rPr>
+              <w:t xml:space="preserve">«Reconoce el origen y evolución de los Sistemas Operativos.»</w:t>
+            </w:r>
+          </w:p>
+          <w:p>
+            <w:pPr>
+              <w:spacing w:before="0" w:after="40" w:line="240" w:lineRule="auto"/>
+            </w:pPr>
+            <w:r>
+              <w:rPr>
+                <w:i/>
+                <w:sz w:val="16"/>
+                <w:szCs w:val="16"/>
+              </w:rPr>
+              <w:t xml:space="preserve">«Reconoce las ventajas y desventajas de los Sistemas Operativos actuales.»</w:t>
+            </w:r>
+          </w:p>
+          <w:p>
+            <w:pPr>
+              <w:spacing w:before="0" w:after="40" w:line="240" w:lineRule="auto"/>
+            </w:pPr>
+            <w:r>
+              <w:rPr>
+                <w:i/>
+                <w:sz w:val="16"/>
+                <w:szCs w:val="16"/>
+              </w:rPr>
+              <w:t xml:space="preserve">«Analiza los diferentes tipos de licencias de software presentes en entornos modernos de computación.»</w:t>
+            </w:r>
+          </w:p>
+          <w:p>
+            <w:pPr>
+              <w:spacing w:before="0" w:after="40" w:line="240" w:lineRule="auto"/>
+            </w:pPr>
+            <w:r>
+              <w:rPr>
+                <w:i/>
+                <w:sz w:val="16"/>
+                <w:szCs w:val="16"/>
+              </w:rPr>
+              <w:t xml:space="preserve">«Analiza el funcionamiento del Sistema Operativo y del Sistema de Aplicación.»</w:t>
+            </w:r>
+          </w:p>
+          <w:p>
+            <w:pPr>
+              <w:spacing w:before="0" w:after="40" w:line="240" w:lineRule="auto"/>
+            </w:pPr>
+            <w:r>
+              <w:rPr>
+                <w:i/>
+                <w:sz w:val="16"/>
+                <w:szCs w:val="16"/>
+              </w:rPr>
+              <w:t xml:space="preserve">«Reconoce los diferentes tipos de administración de procesos utilizados en los Sistemas Operativos.»</w:t>
+            </w:r>
+          </w:p>
+          <w:p>
+            <w:pPr>
+              <w:spacing w:before="0" w:after="40" w:line="240" w:lineRule="auto"/>
+            </w:pPr>
+            <w:r>
+              <w:rPr>
+                <w:i/>
+                <w:sz w:val="16"/>
+                <w:szCs w:val="16"/>
+              </w:rPr>
+              <w:t xml:space="preserve">«Identifica los diferentes tipos de Sistemas de Archivos utilizados por los Sistemas operativos.»</w:t>
+            </w:r>
+          </w:p>
+          <w:p>
+            <w:pPr>
+              <w:spacing w:before="0" w:after="40" w:line="240" w:lineRule="auto"/>
+            </w:pPr>
+            <w:r>
+              <w:rPr>
+                <w:i/>
+                <w:sz w:val="16"/>
+                <w:szCs w:val="16"/>
+              </w:rPr>
+              <w:t xml:space="preserve">«Identifica los diferentes tipos de memoria.»</w:t>
+            </w:r>
+          </w:p>
+          <w:p>
+            <w:pPr>
+              <w:spacing w:before="0" w:after="40" w:line="240" w:lineRule="auto"/>
+            </w:pPr>
+            <w:r>
+              <w:rPr>
+                <w:i/>
+                <w:sz w:val="16"/>
+                <w:szCs w:val="16"/>
+              </w:rPr>
+              <w:t xml:space="preserve">«Analiza el funcionamiento de la administración de memoria.»</w:t>
+            </w:r>
+          </w:p>
+          <w:p>
+            <w:pPr>
+              <w:spacing w:before="0" w:after="40" w:line="240" w:lineRule="auto"/>
+            </w:pPr>
+            <w:r>
+              <w:rPr>
+                <w:i/>
+                <w:sz w:val="16"/>
+                <w:szCs w:val="16"/>
+              </w:rPr>
+              <w:t xml:space="preserve">«Reconoce la importancia de la capacidad de abstracción, análisis y síntesis en los trabajos realizados.»</w:t>
+            </w:r>
+          </w:p>
+          <w:p>
+            <w:pPr>
+              <w:spacing w:before="0" w:after="40" w:line="240" w:lineRule="auto"/>
+            </w:pPr>
+            <w:r>
+              <w:rPr>
+                <w:i/>
+                <w:sz w:val="16"/>
+                <w:szCs w:val="16"/>
+              </w:rPr>
+              <w:t xml:space="preserve">«Reconoce los diferentes tipos de Sistemas de Numeración utilizados en la informática.»</w:t>
+            </w:r>
+          </w:p>
+          <w:p>
+            <w:pPr>
+              <w:spacing w:before="0" w:after="40" w:line="240" w:lineRule="auto"/>
+            </w:pPr>
+            <w:r>
+              <w:rPr>
+                <w:i/>
+                <w:sz w:val="16"/>
+                <w:szCs w:val="16"/>
+              </w:rPr>
+              <w:t xml:space="preserve">«Aplica procedimientos para convertir un número entero o fraccionario de cualquier base.»</w:t>
+            </w:r>
+          </w:p>
+          <w:p>
+            <w:pPr>
+              <w:spacing w:before="0" w:after="40" w:line="240" w:lineRule="auto"/>
+            </w:pPr>
+            <w:r>
+              <w:rPr>
+                <w:i/>
+                <w:sz w:val="16"/>
+                <w:szCs w:val="16"/>
+              </w:rPr>
+              <w:t xml:space="preserve">«Resuelve operaciones con números binarios.»</w:t>
             </w:r>
           </w:p>
         </w:tc>

</xml_diff>